<commit_message>
fix: flatten embedded figures for LibreOffice rendering
</commit_message>
<xml_diff>
--- a/paper/论文冻结结果版_待提交前复核.docx
+++ b/paper/论文冻结结果版_待提交前复核.docx
@@ -687,7 +687,7 @@
       <w:r>
         <w:drawing>
           <wp:inline xmlns:a="http://schemas.openxmlformats.org/drawingml/2006/main" xmlns:pic="http://schemas.openxmlformats.org/drawingml/2006/picture">
-            <wp:extent cx="4953000" cy="1906331"/>
+            <wp:extent cx="4953000" cy="1906332"/>
             <wp:docPr id="1" name="Picture 1" descr="图 1  正式分析电芯的循环寿命分布" title="图 1  正式分析电芯的循环寿命分布"/>
             <wp:cNvGraphicFramePr>
               <a:graphicFrameLocks noChangeAspect="1"/>
@@ -696,7 +696,7 @@
               <a:graphicData uri="http://schemas.openxmlformats.org/drawingml/2006/picture">
                 <pic:pic>
                   <pic:nvPicPr>
-                    <pic:cNvPr id="0" name="q1_01_lifetime_distribution.png"/>
+                    <pic:cNvPr id="0" name="q1_01_lifetime_distribution_rgb.png"/>
                     <pic:cNvPicPr/>
                   </pic:nvPicPr>
                   <pic:blipFill>
@@ -708,7 +708,7 @@
                   <pic:spPr>
                     <a:xfrm>
                       <a:off x="0" y="0"/>
-                      <a:ext cx="4953000" cy="1906331"/>
+                      <a:ext cx="4953000" cy="1906332"/>
                     </a:xfrm>
                     <a:prstGeom prst="rect"/>
                   </pic:spPr>
@@ -748,7 +748,7 @@
               <a:graphicData uri="http://schemas.openxmlformats.org/drawingml/2006/picture">
                 <pic:pic>
                   <pic:nvPicPr>
-                    <pic:cNvPr id="0" name="q1_07_policy_lifetime_top_bottom.png"/>
+                    <pic:cNvPr id="0" name="q1_07_policy_lifetime_top_bottom_rgb.png"/>
                     <pic:cNvPicPr/>
                   </pic:nvPicPr>
                   <pic:blipFill>
@@ -889,7 +889,7 @@
               <a:graphicData uri="http://schemas.openxmlformats.org/drawingml/2006/picture">
                 <pic:pic>
                   <pic:nvPicPr>
-                    <pic:cNvPr id="0" name="m1_m2_oof_comparison.png"/>
+                    <pic:cNvPr id="0" name="m1_m2_oof_comparison_rgb.png"/>
                     <pic:cNvPicPr/>
                   </pic:nvPicPr>
                   <pic:blipFill>
@@ -941,7 +941,7 @@
               <a:graphicData uri="http://schemas.openxmlformats.org/drawingml/2006/picture">
                 <pic:pic>
                   <pic:nvPicPr>
-                    <pic:cNvPr id="0" name="q2_policy_block_bootstrap.png"/>
+                    <pic:cNvPr id="0" name="q2_policy_block_bootstrap_rgb.png"/>
                     <pic:cNvPicPr/>
                   </pic:nvPicPr>
                   <pic:blipFill>
@@ -1332,7 +1332,7 @@
               <a:graphicData uri="http://schemas.openxmlformats.org/drawingml/2006/picture">
                 <pic:pic>
                   <pic:nvPicPr>
-                    <pic:cNvPr id="0" name="secondary_final_observed_predicted.png"/>
+                    <pic:cNvPr id="0" name="secondary_final_observed_predicted_rgb.png"/>
                     <pic:cNvPicPr/>
                   </pic:nvPicPr>
                   <pic:blipFill>
@@ -1908,7 +1908,7 @@
               <a:graphicData uri="http://schemas.openxmlformats.org/drawingml/2006/picture">
                 <pic:pic>
                   <pic:nvPicPr>
-                    <pic:cNvPr id="0" name="q4_train_only_candidate_flow.png"/>
+                    <pic:cNvPr id="0" name="q4_train_only_candidate_flow_rgb.png"/>
                     <pic:cNvPicPr/>
                   </pic:nvPicPr>
                   <pic:blipFill>
@@ -1951,7 +1951,7 @@
       <w:r>
         <w:drawing>
           <wp:inline xmlns:a="http://schemas.openxmlformats.org/drawingml/2006/main" xmlns:pic="http://schemas.openxmlformats.org/drawingml/2006/picture">
-            <wp:extent cx="4953000" cy="3177767"/>
+            <wp:extent cx="4953000" cy="3177766"/>
             <wp:docPr id="7" name="Picture 7" descr="图 7  三类候选策略的 k=100 pilot 排程（待验证）" title="图 7  三类候选策略的 k=100 pilot 排程"/>
             <wp:cNvGraphicFramePr>
               <a:graphicFrameLocks noChangeAspect="1"/>
@@ -1960,7 +1960,7 @@
               <a:graphicData uri="http://schemas.openxmlformats.org/drawingml/2006/picture">
                 <pic:pic>
                   <pic:nvPicPr>
-                    <pic:cNvPr id="0" name="q4_pilot_representatives.png"/>
+                    <pic:cNvPr id="0" name="q4_pilot_representatives_rgb.png"/>
                     <pic:cNvPicPr/>
                   </pic:nvPicPr>
                   <pic:blipFill>
@@ -1972,7 +1972,7 @@
                   <pic:spPr>
                     <a:xfrm>
                       <a:off x="0" y="0"/>
-                      <a:ext cx="4953000" cy="3177767"/>
+                      <a:ext cx="4953000" cy="3177766"/>
                     </a:xfrm>
                     <a:prstGeom prst="rect"/>
                   </pic:spPr>

</xml_diff>